<commit_message>
Job 1 retry (D12): sourced SaaS retention benchmarks
Replace the indicative 4d ranges with figures read from SaaS Capital (2025,
2023 as context), High Alpha (2025), Benchmarkit (2025) and ChartMogul (2023,
context). The figures are a checked-in input, data/reference/benchmarks_source.csv,
which the 04d notebook validates and copies to outputs/tables/benchmarks.csv,
alongside a comparison table, a chart and docs/benchmarks.md.

Databook 4d, key finding F03, the memo (with a source footnote) and the
interview prep now quote the sourced figures. No rating or recommendation
changed. Decisions D12 and D28 resolved; new D35 to D39. Tests tie every
quoted benchmark figure to benchmarks.csv.

Co-Authored-By: Claude Opus 5.5 <noreply@anthropic.com>
Claude-Session: https://claude.ai/code/session_01JYe5m76Q5dzWnkxrjnkzNA
</commit_message>
<xml_diff>
--- a/memo/findings_memo.docx
+++ b/memo/findings_memo.docx
@@ -142,7 +142,7 @@
           <w:b w:val="0"/>
           <w:i w:val="0"/>
         </w:rPr>
-        <w:t>NRR was 95.8%, 98.7% and 95.4% for 2023 to 2025 (89.2% in 2025 before price); GRR fell from 94.5% to 88.8% [4d]. There is no December 2021, so 2022 cannot be measured.</w:t>
+        <w:t>NRR was 95.8%, 98.7% and 95.4% for 2023 to 2025 (89.2% in 2025 before price); GRR fell from 94.5% to 88.8% [4d]. There is no December 2021, so 2022 cannot be measured. Both 2025 figures are below the SaaS Capital SMB benchmark medians, which use our definitions (NRR 98% to 103%, GRR 90% to 91%), and NRR before price is below every SMB median in three 2025 surveys (94% to 107%).[1]</w:t>
       </w:r>
     </w:p>
     <w:p>
@@ -1400,6 +1400,20 @@
           <w:i/>
           <w:sz w:val="14"/>
         </w:rPr>
+        <w:t>[1] Benchmarks: SaaS Capital, 2025 B2B SaaS Retention Benchmarks (Research Brief 32); High Alpha, 2025 SaaS Benchmarks Report; Benchmarkit, 2025 B2B SaaS Performance Metrics Benchmarks. Medians for US$ ACV bands under $50k. Definitions, ranges and caveats: docs/benchmarks.md.</w:t>
+      </w:r>
+    </w:p>
+    <w:p>
+      <w:pPr>
+        <w:spacing w:after="0" w:before="0"/>
+      </w:pPr>
+      <w:r>
+        <w:rPr>
+          <w:rFonts w:ascii="Arial" w:hAnsi="Arial"/>
+          <w:b w:val="0"/>
+          <w:i/>
+          <w:sz w:val="14"/>
+        </w:rPr>
         <w:t>Generated by memo/build_memo.py from outputs/tables/. Synthetic data. This is a self-directed simulation of buy-side financial due diligence on a fictional company, built for a portfolio. It is not client work and uses no real company's data.</w:t>
       </w:r>
     </w:p>

</xml_diff>